<commit_message>
Rewrite response letter with archived release details
</commit_message>
<xml_diff>
--- a/submission/jpbi_response_to_reviewers.docx
+++ b/submission/jpbi_response_to_reviewers.docx
@@ -38,7 +38,7 @@
     </w:p>
     <w:p>
       <w:r>
-        <w:t>We thank the editor and reviewers for their careful and constructive assessment. We revised the manuscript toward a narrower and more reproducible claim. The study is now explicitly framed as a fixed Ridge early-fusion benchmark using cell-line molecular features, not as a general drug-aware prediction framework. We clarified dataset and mutation provenance, softened LOOD interpretation, expanded uncertainty and compound-level reporting, simplified the main figures, and strengthened the reproducibility statement.</w:t>
+        <w:t>We thank the editor and reviewers for their careful and constructive assessment. We revised the manuscript toward a narrower and more reproducible claim. The study is now explicitly framed as a fixed Ridge early-fusion benchmark using cell-line molecular features, not as a general drug-aware prediction framework. We clarified dataset and mutation provenance, softened LOOD interpretation, expanded uncertainty and compound-level reporting, simplified the main figures, and strengthened the reproducibility statement. The reproducibility materials are now publicly archived at https://doi.org/10.5281/zenodo.23054361.</w:t>
       </w:r>
     </w:p>
     <w:p>
@@ -146,9 +146,7 @@
       </w:r>
     </w:p>
     <w:p>
-      <w:r>
-        <w:t>Response: We reorganized the display logic around the estimands. The main figures now provide a compact LOOD summary, a fusion-minus-expression/conflict view, and a modality-availability diagnostic. Redundant modality-resolved and fold-level figures are retained individually as supplementary outputs rather than repeated in the main sequence. A dedicated Q1-Q3 interpretation subsection links each metric to its validation design. See lines 90-111 and Figures 1-3.</w:t>
-      </w:r>
+      <w:r/>
     </w:p>
     <w:p>
       <w:pPr>
@@ -159,9 +157,7 @@
       </w:r>
     </w:p>
     <w:p>
-      <w:r>
-        <w:t>Response: We added an executable workflow description, cross-dataset alignment rules, release identifiers, environment specification, repository URL, split and feature-manifest inventory, and regeneration scripts. The repository is https://github.com/camontefusco/more-omics-is-not-always-better. Raw provider files remain subject to their access terms. See lines 121-133.</w:t>
-      </w:r>
+      <w:r/>
     </w:p>
     <w:p>
       <w:pPr>
@@ -311,9 +307,7 @@
       </w:r>
     </w:p>
     <w:p>
-      <w:r>
-        <w:t>Response: We simplified the main display set. Figure 1 is the compact LOOD summary, Figure 2 the signed fusion contrast/conflict view, and Figure 3 the availability diagnostic. The former modality-resolved and fold-level figures remain individual supplementary files. See lines 96-101.</w:t>
-      </w:r>
+      <w:r/>
     </w:p>
     <w:p>
       <w:pPr>
@@ -511,9 +505,7 @@
       </w:r>
     </w:p>
     <w:p>
-      <w:r>
-        <w:t>Response: We added the concrete repository URL, data-release identifiers, environment specification, main regeneration scripts, manifests, and machine-readable outputs. The final resubmission commit or release tag will be identified in the submitted response package; the working repository alone is not presented as an immutable version. See lines 121-133.</w:t>
-      </w:r>
+      <w:r/>
     </w:p>
     <w:p>
       <w:pPr>

</xml_diff>

<commit_message>
Refine full point-by-point reviewer response
</commit_message>
<xml_diff>
--- a/submission/jpbi_response_to_reviewers.docx
+++ b/submission/jpbi_response_to_reviewers.docx
@@ -38,7 +38,7 @@
     </w:p>
     <w:p>
       <w:r>
-        <w:t>We thank the editor and reviewers for their careful and constructive assessment. We revised the manuscript toward a narrower and more reproducible claim. The study is now explicitly framed as a fixed Ridge early-fusion benchmark using cell-line molecular features, not as a general drug-aware prediction framework. We clarified dataset and mutation provenance, softened LOOD interpretation, expanded uncertainty and compound-level reporting, simplified the main figures, and strengthened the reproducibility statement. The reproducibility materials are now publicly archived at https://doi.org/10.5281/zenodo.23054361.</w:t>
+        <w:t>We thank the editor and reviewers for their careful and constructive assessment. We revised the manuscript toward a narrower and more reproducible claim. The study is now explicitly framed as a fixed Ridge early-fusion benchmark using cell-line molecular features, not as a general drug-aware prediction framework. We clarified dataset and mutation provenance, softened LOOD interpretation, expanded uncertainty and compound-level reporting, simplified the main figures, and strengthened the reproducibility statement. The code and derived artifacts are now publicly archived at https://doi.org/10.5281/zenodo.23054361.</w:t>
       </w:r>
     </w:p>
     <w:p>
@@ -146,7 +146,9 @@
       </w:r>
     </w:p>
     <w:p>
-      <w:r/>
+      <w:r>
+        <w:t>Response: We reorganized the display logic around the estimands. The main figures now provide a compact LOOD summary, a fusion-minus-expression/conflict view, and a modality-availability diagnostic. Redundant modality-resolved and fold-level figures are retained individually as supplementary outputs rather than repeated in the main sequence. A dedicated Q1-Q3 interpretation subsection links each metric to its validation design. See lines 90-111 and Figures 1-3.</w:t>
+      </w:r>
     </w:p>
     <w:p>
       <w:pPr>
@@ -157,7 +159,9 @@
       </w:r>
     </w:p>
     <w:p>
-      <w:r/>
+      <w:r>
+        <w:t>Response: We added an executable workflow description, cross-dataset alignment rules, release identifiers, environment specification, repository URL, split and feature-manifest inventory, and regeneration scripts. The repository is https://github.com/camontefusco/more-omics-is-not-always-better. Raw provider files remain subject to their access terms. See lines 121-133.</w:t>
+      </w:r>
     </w:p>
     <w:p>
       <w:pPr>
@@ -307,7 +311,9 @@
       </w:r>
     </w:p>
     <w:p>
-      <w:r/>
+      <w:r>
+        <w:t>Response: We simplified the main display set. Figure 1 is the compact LOOD summary, Figure 2 the signed fusion contrast/conflict view, and Figure 3 the availability diagnostic. The former modality-resolved and fold-level figures remain individual supplementary files. See lines 96-101.</w:t>
+      </w:r>
     </w:p>
     <w:p>
       <w:pPr>
@@ -505,7 +511,9 @@
       </w:r>
     </w:p>
     <w:p>
-      <w:r/>
+      <w:r>
+        <w:t>Response: We added the concrete repository URL, the immutable GitHub release tag v1.0.1-jpbi-zenodo, and the Zenodo DOI https://doi.org/10.5281/zenodo.23054361. The release contains the data-release identifiers, environment specification, regeneration scripts, split and feature manifests, and machine-readable outputs. Raw provider files remain subject to their access terms. See lines 121-133.</w:t>
+      </w:r>
     </w:p>
     <w:p>
       <w:pPr>

</xml_diff>

<commit_message>
Expand first-person reviewer responses
</commit_message>
<xml_diff>
--- a/submission/jpbi_response_to_reviewers.docx
+++ b/submission/jpbi_response_to_reviewers.docx
@@ -38,7 +38,7 @@
     </w:p>
     <w:p>
       <w:r>
-        <w:t>We thank the editor and reviewers for their careful and constructive assessment. We revised the manuscript toward a narrower and more reproducible claim. The study is now explicitly framed as a fixed Ridge early-fusion benchmark using cell-line molecular features, not as a general drug-aware prediction framework. We clarified dataset and mutation provenance, softened LOOD interpretation, expanded uncertainty and compound-level reporting, simplified the main figures, and strengthened the reproducibility statement. The code and derived artifacts are now publicly archived at https://doi.org/10.5281/zenodo.23054361.</w:t>
+        <w:t>I thank the editor and reviewers for their careful and constructive assessment. We revised the manuscript toward a narrower and more reproducible claim. The study is now explicitly framed as a fixed Ridge early-fusion benchmark using cell-line molecular features, not as a general drug-aware prediction framework. We clarified dataset and mutation provenance, softened LOOD interpretation, expanded uncertainty and compound-level reporting, simplified the main figures, and strengthened the reproducibility statement. The code and derived artifacts are now publicly archived at https://doi.org/10.5281/zenodo.23054361.</w:t>
       </w:r>
     </w:p>
     <w:p>
@@ -75,7 +75,7 @@
     </w:p>
     <w:p>
       <w:r>
-        <w:t>Response: We added a dataset-characterization table reporting the selected compounds, response rows, unique cell lines, AUC minimum, quartiles, median, maximum, raw feature counts, and modality coverage for GDSC1, GDSC2, and CTD². We now state that source-specific response values are retained without cross-dataset rescaling and that RMSE and MAE are interpreted within dataset and validation fold, not used to rank cross-dataset difficulty. See clean manuscript lines 35-43 and Table 1.</w:t>
+        <w:t>Response: I added a dataset-characterization table reporting the selected compounds, response rows, unique cell lines, AUC minimum, quartiles, median, maximum, raw feature counts, and modality coverage for GDSC1, GDSC2, and CTD². I now state that source-specific response values are retained without cross-dataset rescaling and that RMSE and MAE are interpreted within dataset and validation fold, not used to rank cross-dataset difficulty. See clean manuscript lines 35-43 and Table 1. I also separated the tables from the manuscript file for submission and retained the machine-readable dataset-characterization artifact in the public release. This makes the response-scale limitation explicit rather than implying that a pooled RMSE compares assay systems on a common scale.</w:t>
       </w:r>
     </w:p>
     <w:p>
@@ -99,7 +99,7 @@
     </w:p>
     <w:p>
       <w:r>
-        <w:t>Response: We agree. The LOOD interpretation now states that source, compounds, cell lines, assay procedures, response construction, response scale, and modality availability change simultaneously. LOOD is described as a portability stress test of the complete pipeline, not as a causal test of multimodal integration. See lines 75-82 and lines 112-119.</w:t>
+        <w:t>Response: I agree. The LOOD interpretation now states that source, compounds, cell lines, assay procedures, response construction, response scale, and modality availability change simultaneously. LOOD is described as a portability stress test of the complete pipeline, not as a causal test of multimodal integration. See lines 75-82 and lines 112-119. The revised text therefore treats the LOOD result as evidence about transfer of the complete data and modeling pipeline. It does not identify multimodal integration as the cause of any degradation, and I removed wording that could be read as a causal attribution.</w:t>
       </w:r>
     </w:p>
     <w:p>
@@ -123,7 +123,7 @@
     </w:p>
     <w:p>
       <w:r>
-        <w:t>Response: We expanded the Methods to describe compound inclusion, depmap_id matching, provider-supplied damaging-mutation encoding, fold-local variance selection, training-fold median imputation, training-fold standardization, and fixed Ridge alpha=1.0. We also state that the model has no drug identity, structure, target, dose, or mechanism features; therefore the drug-held-out analysis is a limited transfer stress test within the declared universe, not arbitrary unseen-drug prediction. See lines 45-68.</w:t>
+        <w:t>Response: I expanded the Methods to describe compound inclusion, depmap_id matching, provider-supplied damaging-mutation encoding, fold-local variance selection, training-fold median imputation, training-fold standardization, and fixed Ridge alpha=1.0. I also state that the model has no drug identity, structure, target, dose, or mechanism features; therefore the drug-held-out analysis is a limited transfer stress test within the declared universe, not arbitrary unseen-drug prediction. See lines 45-68. The revised Methods also state how rows were joined, how unmatched cell lines were handled, which operations were fit only on training rows, and why alpha was fixed. I added the absence of drug descriptors as a design limitation rather than presenting the analysis as conventional prediction for a chemically novel compound.</w:t>
       </w:r>
     </w:p>
     <w:p>
@@ -147,7 +147,7 @@
     </w:p>
     <w:p>
       <w:r>
-        <w:t>Response: We reorganized the display logic around the estimands. The main figures now provide a compact LOOD summary, a fusion-minus-expression/conflict view, and a modality-availability diagnostic. Redundant modality-resolved and fold-level figures are retained individually as supplementary outputs rather than repeated in the main sequence. A dedicated Q1-Q3 interpretation subsection links each metric to its validation design. See lines 90-111 and Figures 1-3.</w:t>
+        <w:t>Response: I reorganized the display logic around the estimands. The main figures now provide a compact LOOD summary, a fusion-minus-expression/conflict view, and a modality-availability diagnostic. Redundant modality-resolved and fold-level figures are retained individually as supplementary outputs rather than repeated in the main sequence. A dedicated Q1-Q3 interpretation subsection links each metric to its validation design. See lines 90-111 and Figures 1-3. I also corrected the figure numbering and supplied each main figure as an individual PNG file. The manuscript references the displays in the order Figure 1 decision framework, Figure 2 transfer overview, Figure 3 fusion contrast and conflict, and Figure 4 availability; tables are supplied separately as a Word file.</w:t>
       </w:r>
     </w:p>
     <w:p>
@@ -160,7 +160,7 @@
     </w:p>
     <w:p>
       <w:r>
-        <w:t>Response: We added an executable workflow description, cross-dataset alignment rules, release identifiers, environment specification, repository URL, split and feature-manifest inventory, and regeneration scripts. The repository is https://github.com/camontefusco/more-omics-is-not-always-better. Raw provider files remain subject to their access terms. See lines 121-133.</w:t>
+        <w:t>Response: I added an executable workflow description, cross-dataset alignment rules, release identifiers, environment specification, repository URL, split and feature-manifest inventory, and regeneration scripts. The repository is https://github.com/camontefusco/more-omics-is-not-always-better. Raw provider files remain subject to their access terms. See lines 121-133. The final public archive is now available at https://doi.org/10.5281/zenodo.23054361 and is linked to GitHub release v1.0.1-jpbi-zenodo. The release is immutable and includes the final code, tests, manifests, frozen results, figures, manuscript files, and environment specification; provider data remain excluded.</w:t>
       </w:r>
     </w:p>
     <w:p>
@@ -192,7 +192,7 @@
     </w:p>
     <w:p>
       <w:r>
-        <w:t>Response: We added a focused Introduction paragraph reviewing expression-only baselines, multimodal studies such as MOLI and DrugCell, and the uncertainty about whether mutation and copy-number add stable value beyond expression under external or cross-dataset validation. We explain how feature budgets, learners, response definitions, and split units limit direct comparison. See lines 16-24.</w:t>
+        <w:t>Response: I added a focused Introduction paragraph reviewing expression-only baselines, multimodal studies such as MOLI and DrugCell, and the uncertainty about whether mutation and copy-number add stable value beyond expression under external or cross-dataset validation. I explain how feature budgets, learners, response definitions, and split units limit direct comparison. See lines 16-24. I then state the narrower contribution: a controlled comparison of one expression-only baseline and one early-fusion Ridge construction under grouped drug-held-out and source-held-out evaluation. I do not claim to resolve the broader literature question for all learners, drug-aware models, or datasets.</w:t>
       </w:r>
     </w:p>
     <w:p>
@@ -216,7 +216,7 @@
     </w:p>
     <w:p>
       <w:r>
-        <w:t>Response: We state that the benchmark used a predeclared source-balanced subset of five compounds per source. Inclusion required exact source identifiers, sufficient response records, and consistent cell-line/molecular matching; compounds absent or inconsistently matched were excluded, and no selection was changed after performance inspection. We also compare the subset with the broader source-level drug counts and state that it is not representative of the full drug universe. See lines 42-44 and Supplementary Table S1.</w:t>
+        <w:t>Response: I state that the benchmark used a predeclared source-balanced subset of five compounds per source. Inclusion required exact source identifiers, sufficient response records, and consistent cell-line/molecular matching; compounds absent or inconsistently matched were excluded, and no selection was changed after performance inspection. I also compare the subset with the broader source-level drug counts and state that it is not representative of the full drug universe. See lines 42-44 and Supplementary Table S1. I now identify the exact source-balanced design as a pragmatic benchmark construction rather than a random sample of available compounds. The manuscript reports the resulting coverage and explicitly warns that the 15-compound universe limits external generalization.</w:t>
       </w:r>
     </w:p>
     <w:p>
@@ -240,7 +240,7 @@
     </w:p>
     <w:p>
       <w:r>
-        <w:t>Response: We clarify that the matrix was taken from DepMap Public 26Q1, “Damaging Mutations (Public 26Q1),” rather than reconstructed from raw variant calls. Gene-level columns and source-defined damaging classifications were retained; missing values were not treated as benign, and remaining missing selected values were imputed only with training-fold medians. No variant reclassification or new pathogenicity model was performed. See lines 50-54.</w:t>
+        <w:t>Response: I clarify that the matrix was taken from DepMap Public 26Q1, “Damaging Mutations (Public 26Q1),” rather than reconstructed from raw variant calls. Gene-level columns and source-defined damaging classifications were retained; missing values were not treated as benign, and remaining missing selected values were imputed only with training-fold medians. No variant reclassification or new pathogenicity model was performed. See lines 50-54. This distinction prevents the analysis from silently converting unknown mutation status into a negative mutation call. The same rule is applied consistently across modalities and folds, and the supplementary material records the provenance and missingness handling.</w:t>
       </w:r>
     </w:p>
     <w:p>
@@ -264,7 +264,7 @@
     </w:p>
     <w:p>
       <w:r>
-        <w:t>Response: We clarified that the five grouped splits cover eight unique compounds and are not a complete 15-drug leave-one-out design. The existing per-drug audit is explicitly descriptive. Complete leave-one-drug-out validation across all 15 compounds, with reliable mechanism strata, is identified as future work rather than implied to have been performed. See lines 67-70 and 115-119.</w:t>
+        <w:t>Response: I clarified that the five grouped splits cover eight unique compounds and are not a complete 15-drug leave-one-out design. The existing per-drug audit is explicitly descriptive. Complete leave-one-drug-out validation across all 15 compounds, with reliable mechanism strata, is identified as future work rather than implied to have been performed. See lines 67-70 and 115-119. I retained the existing five split manifests because they are the prespecified benchmark actually analyzed, but I no longer describe them as exhaustive leave-one-drug-out validation. I state that a complete 15-drug design would be a stronger future analysis and would require a separate frozen manifest.</w:t>
       </w:r>
     </w:p>
     <w:p>
@@ -288,7 +288,7 @@
     </w:p>
     <w:p>
       <w:r>
-        <w:t>Response: We added paired drug-group summaries: 15 drug-seed cells, eight unique compounds, mean fusion-minus-expression RMSE −0.0009, sample SD 0.0019, median −0.0019, IQR −0.0023 to 0.0006, range −0.0031 to +0.0022, with fusion favorable in 11 cells and unfavorable in four. Individual compound values are reported in the Results and machine-readable summary. These are empirical variability summaries, not independent confidence intervals. See lines 85-91.</w:t>
+        <w:t>Response: I added paired drug-group summaries: 15 drug-seed cells, eight unique compounds, mean fusion-minus-expression RMSE −0.0009, sample SD 0.0019, median −0.0019, IQR −0.0023 to 0.0006, range −0.0031 to +0.0022, with fusion favorable in 11 cells and unfavorable in four. Individual compound values are reported in the Results and machine-readable summary. These are empirical variability summaries, not independent confidence intervals. See lines 85-91. These summaries are paired within the same drug and seed, so they show the size and direction of observed differences without treating repeated partitions as independent biological experiments. I also explain that the small average difference should not be converted into a claim of stable superiority.</w:t>
       </w:r>
     </w:p>
     <w:p>
@@ -312,7 +312,7 @@
     </w:p>
     <w:p>
       <w:r>
-        <w:t>Response: We simplified the main display set. Figure 1 is the compact LOOD summary, Figure 2 the signed fusion contrast/conflict view, and Figure 3 the availability diagnostic. The former modality-resolved and fold-level figures remain individual supplementary files. See lines 96-101.</w:t>
+        <w:t>Response: I simplified the main display set. Figure 1 is the compact LOOD summary, Figure 2 the signed fusion contrast/conflict view, and Figure 3 the availability diagnostic. The former modality-resolved and fold-level figures remain individual supplementary files. See lines 96-101. This removes the previous duplication and makes the visual sequence match the manuscript narrative. The supplementary files preserve detail without forcing the reader to interpret several versions of the same comparison in the main text.</w:t>
       </w:r>
     </w:p>
     <w:p>
@@ -336,7 +336,7 @@
     </w:p>
     <w:p>
       <w:r>
-        <w:t>Response: We replaced “H2 was supported” and “consistent cross-study degradation” with language describing a less favorable fusion contrast in the observed source-held-out setting. We explicitly state that this is not a causal or general law because multiple dataset properties change simultaneously. See lines 112-119.</w:t>
+        <w:t>Response: I replaced “H2 was supported” and “consistent cross-study degradation” with language describing a less favorable fusion contrast in the observed source-held-out setting. I explicitly state that this is not a causal or general law because multiple dataset properties change simultaneously. See lines 112-119. The revised wording now says that fusion was less favorable in the observed source-held-out folds, while acknowledging that the comparison changes the source, compounds, cell lines, assay context, and response scale together.</w:t>
       </w:r>
     </w:p>
     <w:p>
@@ -360,7 +360,7 @@
     </w:p>
     <w:p>
       <w:r>
-        <w:t>Response: We added a concise compound-level discussion. ACY-1215 and DACOMITINIB had the largest favorable mean deltas in the observed audit, while GSK1059615 and STAUROSPORINE had unfavorable mean deltas. We state that these are descriptive and do not establish mechanism-of-action effects because there is no drug-aware input, no complete 15-drug LODO analysis, and no formal mechanism-stratified test. See lines 124-129.</w:t>
+        <w:t>Response: I added a concise compound-level discussion. ACY-1215 and DACOMITINIB had the largest favorable mean deltas in the observed audit, while GSK1059615 and STAUROSPORINE had unfavorable mean deltas. I state that these are descriptive and do not establish mechanism-of-action effects because there is no drug-aware input, no complete 15-drug LODO analysis, and no formal mechanism-stratified test. See lines 124-129. I also added the practical interpretation that a compound-specific difference can motivate follow-up investigation or assay prioritization, but cannot by itself identify a mechanism or justify a biomarker claim. Repeated effects across a larger, drug-aware and mechanism-annotated universe remain necessary.</w:t>
       </w:r>
     </w:p>
     <w:p>
@@ -392,7 +392,7 @@
     </w:p>
     <w:p>
       <w:r>
-        <w:t>Response: We revised the estimand and terminology throughout. The model uses only cell-line molecular features and cannot learn a drug-specific response function in the usual sense. Drug-held-out validation is now described as transfer of a cell-line-only relationship to held-out records within the declared universe. Drug-aware modeling is explicitly future work. See lines 61-63, 91-94, and 124-129.</w:t>
+        <w:t>Response: I revised the estimand and terminology throughout. The model uses only cell-line molecular features and cannot learn a drug-specific response function in the usual sense. Drug-held-out validation is now described as transfer of a cell-line-only relationship to held-out records within the declared universe. Drug-aware modeling is explicitly future work. See lines 61-63, 91-94, and 124-129. I also added explicit non-use statements: the results should not be used to predict an arbitrary new drug, select patient treatment, make causal claims about mutation or copy-number biology, or replace experimental validation. A drug-aware framework with chemical, target, or mechanism features is identified as future work.</w:t>
       </w:r>
     </w:p>
     <w:p>
@@ -416,7 +416,7 @@
     </w:p>
     <w:p>
       <w:r>
-        <w:t>Response: We added explicit selection criteria, broader source-level drug counts, selected response counts, and the limitation that the subset is pragmatic and non-representative. See lines 42-44.</w:t>
+        <w:t>Response: I added explicit selection criteria, broader source-level drug counts, selected response counts, and the limitation that the subset is pragmatic and non-representative. See lines 42-44. I now connect this limitation to the interpretation of every aggregate result: the reported effect is conditional on the selected 15 compounds, their response distributions, and their available cell lines. I did not extend the claims to the full GDSC or CTD² drug universes.</w:t>
       </w:r>
     </w:p>
     <w:p>
@@ -440,7 +440,7 @@
     </w:p>
     <w:p>
       <w:r>
-        <w:t>Response: We added paired compound-level effect summaries and report their empirical variability, while avoiding formal significance claims because drug-seed cells are not independent. More extensive repeated grouped validation and complete LODO are identified as future work. See lines 85-91 and 115-119.</w:t>
+        <w:t>Response: I added paired compound-level effect summaries and report their empirical variability, while avoiding formal significance claims because drug-seed cells are not independent. More extensive repeated grouped validation and complete LODO are identified as future work. See lines 85-91 and 115-119. I report the direction across the observed drug-seed cells and explain why this is descriptive uncertainty rather than a confidence interval for a population effect. The manuscript now treats more extensive repeated grouped validation as a necessary next step, not as an analysis already completed.</w:t>
       </w:r>
     </w:p>
     <w:p>
@@ -464,7 +464,7 @@
     </w:p>
     <w:p>
       <w:r>
-        <w:t>Response: We now state explicitly that fusion changes both information content and dimensionality under the same alpha=1 penalty. The current comparison is not a pure estimate of biological complementarity. Equalized budgets, tuned regularization, and group-wise penalties are future sensitivity analyses. See lines 55-60 and 130-133.</w:t>
+        <w:t>Response: I now state explicitly that fusion changes both information content and dimensionality under the same alpha=1 penalty. The current comparison is not a pure estimate of biological complementarity. Equalized budgets, tuned regularization, and group-wise penalties are future sensitivity analyses. See lines 55-60 and 130-133. I added this qualification to the interpretation of the primary effect. Thus, the result is about the evaluated model comparison, in which information and feature dimensionality change together, and not a clean decomposition of biological complementarity from model complexity.</w:t>
       </w:r>
     </w:p>
     <w:p>
@@ -488,7 +488,7 @@
     </w:p>
     <w:p>
       <w:r>
-        <w:t>Response: We restrict conclusions to the fixed Ridge early-fusion construction and list drug representations, nonlinear learners, late fusion, group-wise regularization, modality completion, and missing-modality-aware models as untested alternatives. See lines 60-63 and 130-133.</w:t>
+        <w:t>Response: I restrict conclusions to the fixed Ridge early-fusion construction and list drug representations, nonlinear learners, late fusion, group-wise regularization, modality completion, and missing-modality-aware models as untested alternatives. See lines 60-63 and 130-133. I therefore removed broader statements about multimodal pharmacogenomics in general and retained only conclusions supported by this Ridge early-fusion experiment. The Discussion names the untested alternatives as scope limitations and future work.</w:t>
       </w:r>
     </w:p>
     <w:p>
@@ -512,7 +512,7 @@
     </w:p>
     <w:p>
       <w:r>
-        <w:t>Response: We added the concrete repository URL, the immutable GitHub release tag v1.0.1-jpbi-zenodo, and the Zenodo DOI https://doi.org/10.5281/zenodo.23054361. The release contains the data-release identifiers, environment specification, regeneration scripts, split and feature manifests, and machine-readable outputs. Raw provider files remain subject to their access terms. See lines 121-133.</w:t>
+        <w:t>Response: I added the concrete repository URL, the immutable GitHub release tag v1.0.1-jpbi-zenodo, and the Zenodo DOI https://doi.org/10.5281/zenodo.23054361. The release contains the data-release identifiers, environment specification, regeneration scripts, split and feature manifests, and machine-readable outputs. Raw provider files remain subject to their access terms. See lines 121-133. The data-availability statement now points to both the working repository and the permanent DOI. I also state that a clean rerun still requires authorized downloads of the named provider releases, so the archive supports reproducibility without claiming that restricted raw matrices are redistributed.</w:t>
       </w:r>
     </w:p>
     <w:p>
@@ -540,7 +540,7 @@
     </w:p>
     <w:p>
       <w:r>
-        <w:t>We appreciate the reviewers’ comments, which helped us narrow the estimand, improve methodological transparency, and align the claims with the evidence.</w:t>
+        <w:t>I appreciate the reviewers’ comments, which helped us narrow the estimand, improve methodological transparency, and align the claims with the evidence.</w:t>
       </w:r>
     </w:p>
     <w:p>

</xml_diff>

<commit_message>
Restore selected manuscript title across package
</commit_message>
<xml_diff>
--- a/submission/jpbi_response_to_reviewers.docx
+++ b/submission/jpbi_response_to_reviewers.docx
@@ -39,24 +39,11 @@
         </w:rPr>
       </w:pPr>
       <w:r>
-        <w:rPr>
-          <w:rFonts w:ascii="Arial" w:hAnsi="Arial"/>
-          <w:b/>
-          <w:sz w:val="24"/>
-          <w:szCs w:val="24"/>
-        </w:rPr>
         <w:t>Journal of Pharmaceutical and BioTech Industry</w:t>
         <w:br/>
         <w:t>Manuscript ID: jpbi-4567094</w:t>
         <w:br/>
-      </w:r>
-      <w:r>
-        <w:rPr>
-          <w:rFonts w:ascii="Arial" w:hAnsi="Arial"/>
-          <w:sz w:val="24"/>
-          <w:szCs w:val="24"/>
-        </w:rPr>
-        <w:t>Title: Multimodal Cancer Drug-Response Prediction Shows Small, Validation-Dependent Gains in a 15-Compound DepMap Benchmark</w:t>
+        <w:t>Title: When More Omics Is Not Always Better: Drug- and Dataset-Conditional Value of Multimodal Cancer Pharmacogenomics</w:t>
       </w:r>
     </w:p>
     <w:p>

</xml_diff>